<commit_message>
add info to tech assignment
</commit_message>
<xml_diff>
--- a/docs/PriceWatch_Technical_Assignment_RU.docx
+++ b/docs/PriceWatch_Technical_Assignment_RU.docx
@@ -64,6 +64,33 @@
       </w:pPr>
       <w:r>
         <w:t>2. Целевая аудитория и ее боли</w:t>
+      </w:r>
+    </w:p>
+    <w:p>
+      <w:pPr/>
+      <w:r>
+        <w:rPr>
+          <w:b/>
+        </w:rPr>
+        <w:t>Основная целевая аудитория — частные покупатели, которые отслеживают цены интересующих их товаров в интернет-магазинах и хотят выбрать выгодный момент для покупки.</w:t>
+      </w:r>
+    </w:p>
+    <w:p>
+      <w:pPr/>
+      <w:r>
+        <w:rPr>
+          <w:b w:val="0"/>
+        </w:rPr>
+        <w:t>Дополнительная аудитория — пользователи, наблюдающие за предложениями нескольких магазинов, а также небольшие продавцы и специалисты по закупкам, которым нужен простой мониторинг цен отдельных товаров.</w:t>
+      </w:r>
+    </w:p>
+    <w:p>
+      <w:pPr/>
+      <w:r>
+        <w:rPr>
+          <w:b w:val="0"/>
+        </w:rPr>
+        <w:t>PriceWatch особенно полезен тем, кто не хочет ежедневно проверять сайты вручную. Работа с товарами, проверками и уведомлениями ведется через Telegram; отдельный веб-интерфейс не требуется.</w:t>
       </w:r>
     </w:p>
     <w:tbl>

</xml_diff>